<commit_message>
Improve launch pack funnel and member assets
</commit_message>
<xml_diff>
--- a/content/member-assets/manual-workflow-concierge/ai-automation-pack.docx
+++ b/content/member-assets/manual-workflow-concierge/ai-automation-pack.docx
@@ -673,13 +673,13 @@
         <w:tblLook w:firstRow="1" w:noHBand="0" w:noVBand="1"/>
       </w:tblPr>
       <w:tblGrid>
-        <w:gridCol w:w="1180"/>
-        <w:gridCol w:w="7940"/>
+        <w:gridCol w:w="1500"/>
+        <w:gridCol w:w="7620"/>
       </w:tblGrid>
       <w:tr>
         <w:tc>
           <w:tcPr>
-            <w:tcW w:w="1180" w:type="dxa"/>
+            <w:tcW w:w="1500" w:type="dxa"/>
             <w:shd w:fill="0A0A0A"/>
             <w:tcMar>
               <w:top w:w="120" w:type="dxa"/>
@@ -700,7 +700,7 @@
         </w:tc>
         <w:tc>
           <w:tcPr>
-            <w:tcW w:w="7940" w:type="dxa"/>
+            <w:tcW w:w="7620" w:type="dxa"/>
             <w:shd w:fill="0A0A0A"/>
             <w:tcMar>
               <w:top w:w="120" w:type="dxa"/>
@@ -723,7 +723,7 @@
       <w:tr>
         <w:tc>
           <w:tcPr>
-            <w:tcW w:w="1180" w:type="dxa"/>
+            <w:tcW w:w="1500" w:type="dxa"/>
             <w:shd w:fill="F5F3F1"/>
             <w:tcMar>
               <w:top w:w="120" w:type="dxa"/>
@@ -744,7 +744,7 @@
         </w:tc>
         <w:tc>
           <w:tcPr>
-            <w:tcW w:w="7940" w:type="dxa"/>
+            <w:tcW w:w="7620" w:type="dxa"/>
             <w:shd w:fill="F5F3F1"/>
             <w:tcMar>
               <w:top w:w="120" w:type="dxa"/>
@@ -767,7 +767,7 @@
       <w:tr>
         <w:tc>
           <w:tcPr>
-            <w:tcW w:w="1180" w:type="dxa"/>
+            <w:tcW w:w="1500" w:type="dxa"/>
             <w:tcMar>
               <w:top w:w="120" w:type="dxa"/>
               <w:left w:w="150" w:type="dxa"/>
@@ -787,7 +787,7 @@
         </w:tc>
         <w:tc>
           <w:tcPr>
-            <w:tcW w:w="7940" w:type="dxa"/>
+            <w:tcW w:w="7620" w:type="dxa"/>
             <w:tcMar>
               <w:top w:w="120" w:type="dxa"/>
               <w:left w:w="150" w:type="dxa"/>
@@ -809,7 +809,7 @@
       <w:tr>
         <w:tc>
           <w:tcPr>
-            <w:tcW w:w="1180" w:type="dxa"/>
+            <w:tcW w:w="1500" w:type="dxa"/>
             <w:shd w:fill="F5F3F1"/>
             <w:tcMar>
               <w:top w:w="120" w:type="dxa"/>
@@ -830,7 +830,7 @@
         </w:tc>
         <w:tc>
           <w:tcPr>
-            <w:tcW w:w="7940" w:type="dxa"/>
+            <w:tcW w:w="7620" w:type="dxa"/>
             <w:shd w:fill="F5F3F1"/>
             <w:tcMar>
               <w:top w:w="120" w:type="dxa"/>
@@ -853,7 +853,7 @@
       <w:tr>
         <w:tc>
           <w:tcPr>
-            <w:tcW w:w="1180" w:type="dxa"/>
+            <w:tcW w:w="1500" w:type="dxa"/>
             <w:tcMar>
               <w:top w:w="120" w:type="dxa"/>
               <w:left w:w="150" w:type="dxa"/>
@@ -873,7 +873,7 @@
         </w:tc>
         <w:tc>
           <w:tcPr>
-            <w:tcW w:w="7940" w:type="dxa"/>
+            <w:tcW w:w="7620" w:type="dxa"/>
             <w:tcMar>
               <w:top w:w="120" w:type="dxa"/>
               <w:left w:w="150" w:type="dxa"/>
@@ -895,7 +895,7 @@
       <w:tr>
         <w:tc>
           <w:tcPr>
-            <w:tcW w:w="1180" w:type="dxa"/>
+            <w:tcW w:w="1500" w:type="dxa"/>
             <w:shd w:fill="F5F3F1"/>
             <w:tcMar>
               <w:top w:w="120" w:type="dxa"/>
@@ -916,7 +916,7 @@
         </w:tc>
         <w:tc>
           <w:tcPr>
-            <w:tcW w:w="7940" w:type="dxa"/>
+            <w:tcW w:w="7620" w:type="dxa"/>
             <w:shd w:fill="F5F3F1"/>
             <w:tcMar>
               <w:top w:w="120" w:type="dxa"/>
@@ -939,7 +939,7 @@
       <w:tr>
         <w:tc>
           <w:tcPr>
-            <w:tcW w:w="1180" w:type="dxa"/>
+            <w:tcW w:w="1500" w:type="dxa"/>
             <w:tcMar>
               <w:top w:w="120" w:type="dxa"/>
               <w:left w:w="150" w:type="dxa"/>
@@ -959,7 +959,7 @@
         </w:tc>
         <w:tc>
           <w:tcPr>
-            <w:tcW w:w="7940" w:type="dxa"/>
+            <w:tcW w:w="7620" w:type="dxa"/>
             <w:tcMar>
               <w:top w:w="120" w:type="dxa"/>
               <w:left w:w="150" w:type="dxa"/>
@@ -981,7 +981,7 @@
       <w:tr>
         <w:tc>
           <w:tcPr>
-            <w:tcW w:w="1180" w:type="dxa"/>
+            <w:tcW w:w="1500" w:type="dxa"/>
             <w:shd w:fill="F5F3F1"/>
             <w:tcMar>
               <w:top w:w="120" w:type="dxa"/>
@@ -1002,7 +1002,7 @@
         </w:tc>
         <w:tc>
           <w:tcPr>
-            <w:tcW w:w="7940" w:type="dxa"/>
+            <w:tcW w:w="7620" w:type="dxa"/>
             <w:shd w:fill="F5F3F1"/>
             <w:tcMar>
               <w:top w:w="120" w:type="dxa"/>
@@ -1025,7 +1025,7 @@
       <w:tr>
         <w:tc>
           <w:tcPr>
-            <w:tcW w:w="1180" w:type="dxa"/>
+            <w:tcW w:w="1500" w:type="dxa"/>
             <w:tcMar>
               <w:top w:w="120" w:type="dxa"/>
               <w:left w:w="150" w:type="dxa"/>
@@ -1045,7 +1045,7 @@
         </w:tc>
         <w:tc>
           <w:tcPr>
-            <w:tcW w:w="7940" w:type="dxa"/>
+            <w:tcW w:w="7620" w:type="dxa"/>
             <w:tcMar>
               <w:top w:w="120" w:type="dxa"/>
               <w:left w:w="150" w:type="dxa"/>
@@ -1067,7 +1067,7 @@
       <w:tr>
         <w:tc>
           <w:tcPr>
-            <w:tcW w:w="1180" w:type="dxa"/>
+            <w:tcW w:w="1500" w:type="dxa"/>
             <w:shd w:fill="F5F3F1"/>
             <w:tcMar>
               <w:top w:w="120" w:type="dxa"/>
@@ -1088,7 +1088,7 @@
         </w:tc>
         <w:tc>
           <w:tcPr>
-            <w:tcW w:w="7940" w:type="dxa"/>
+            <w:tcW w:w="7620" w:type="dxa"/>
             <w:shd w:fill="F5F3F1"/>
             <w:tcMar>
               <w:top w:w="120" w:type="dxa"/>
@@ -1111,7 +1111,7 @@
       <w:tr>
         <w:tc>
           <w:tcPr>
-            <w:tcW w:w="1180" w:type="dxa"/>
+            <w:tcW w:w="1500" w:type="dxa"/>
             <w:tcMar>
               <w:top w:w="120" w:type="dxa"/>
               <w:left w:w="150" w:type="dxa"/>
@@ -1131,7 +1131,7 @@
         </w:tc>
         <w:tc>
           <w:tcPr>
-            <w:tcW w:w="7940" w:type="dxa"/>
+            <w:tcW w:w="7620" w:type="dxa"/>
             <w:tcMar>
               <w:top w:w="120" w:type="dxa"/>
               <w:left w:w="150" w:type="dxa"/>

</xml_diff>